<commit_message>
Insert 400 DPI Draw.io architecture diagram into Word proposal and update README flowchart
</commit_message>
<xml_diff>
--- a/submission_assets/VoiceArmor_Edge_Proposal.docx
+++ b/submission_assets/VoiceArmor_Edge_Proposal.docx
@@ -646,6 +646,58 @@
           <w:color w:val="3C3C3C"/>
         </w:rPr>
         <w:t>Step 4 - Alert System: Windows notification + Arduino UNO Q red LED and buzzer.</w:t>
+      </w:r>
+    </w:p>
+    <w:p>
+      <w:pPr>
+        <w:jc w:val="center"/>
+      </w:pPr>
+      <w:r>
+        <w:drawing>
+          <wp:inline xmlns:a="http://schemas.openxmlformats.org/drawingml/2006/main" xmlns:pic="http://schemas.openxmlformats.org/drawingml/2006/picture">
+            <wp:extent cx="5943600" cy="2649619"/>
+            <wp:docPr id="1" name="Picture 1"/>
+            <wp:cNvGraphicFramePr>
+              <a:graphicFrameLocks noChangeAspect="1"/>
+            </wp:cNvGraphicFramePr>
+            <a:graphic>
+              <a:graphicData uri="http://schemas.openxmlformats.org/drawingml/2006/picture">
+                <pic:pic>
+                  <pic:nvPicPr>
+                    <pic:cNvPr id="0" name="voicearmor_architecture.png"/>
+                    <pic:cNvPicPr/>
+                  </pic:nvPicPr>
+                  <pic:blipFill>
+                    <a:blip r:embed="rId8"/>
+                    <a:stretch>
+                      <a:fillRect/>
+                    </a:stretch>
+                  </pic:blipFill>
+                  <pic:spPr>
+                    <a:xfrm>
+                      <a:off x="0" y="0"/>
+                      <a:ext cx="5943600" cy="2649619"/>
+                    </a:xfrm>
+                    <a:prstGeom prst="rect"/>
+                  </pic:spPr>
+                </pic:pic>
+              </a:graphicData>
+            </a:graphic>
+          </wp:inline>
+        </w:drawing>
+      </w:r>
+    </w:p>
+    <w:p>
+      <w:pPr>
+        <w:jc w:val="center"/>
+      </w:pPr>
+      <w:r>
+        <w:rPr>
+          <w:i/>
+          <w:color w:val="646464"/>
+          <w:sz w:val="18"/>
+        </w:rPr>
+        <w:t>Figure 1: VoiceArmor-Edge End-to-End System Architecture</w:t>
       </w:r>
     </w:p>
     <w:p>

</xml_diff>

<commit_message>
Update Word proposal with latest architecture diagram and Testing & Accessibility bullet point
</commit_message>
<xml_diff>
--- a/submission_assets/VoiceArmor_Edge_Proposal.docx
+++ b/submission_assets/VoiceArmor_Edge_Proposal.docx
@@ -653,22 +653,26 @@
         <w:jc w:val="center"/>
       </w:pPr>
       <w:r>
+        <w:rPr>
+          <w:noProof/>
+        </w:rPr>
         <w:drawing>
-          <wp:inline xmlns:a="http://schemas.openxmlformats.org/drawingml/2006/main" xmlns:pic="http://schemas.openxmlformats.org/drawingml/2006/picture">
-            <wp:extent cx="5943600" cy="2649619"/>
+          <wp:inline distT="0" distB="0" distL="0" distR="0" wp14:anchorId="0409A478" wp14:editId="3D170956">
+            <wp:extent cx="6106453" cy="2848529"/>
+            <wp:effectExtent l="0" t="0" r="0" b="0"/>
             <wp:docPr id="1" name="Picture 1"/>
             <wp:cNvGraphicFramePr>
-              <a:graphicFrameLocks noChangeAspect="1"/>
+              <a:graphicFrameLocks xmlns:a="http://schemas.openxmlformats.org/drawingml/2006/main" noChangeAspect="1"/>
             </wp:cNvGraphicFramePr>
-            <a:graphic>
+            <a:graphic xmlns:a="http://schemas.openxmlformats.org/drawingml/2006/main">
               <a:graphicData uri="http://schemas.openxmlformats.org/drawingml/2006/picture">
-                <pic:pic>
+                <pic:pic xmlns:pic="http://schemas.openxmlformats.org/drawingml/2006/picture">
                   <pic:nvPicPr>
                     <pic:cNvPr id="0" name="voicearmor_architecture.png"/>
                     <pic:cNvPicPr/>
                   </pic:nvPicPr>
                   <pic:blipFill>
-                    <a:blip r:embed="rId8"/>
+                    <a:blip r:embed="rId6"/>
                     <a:stretch>
                       <a:fillRect/>
                     </a:stretch>
@@ -676,9 +680,11 @@
                   <pic:spPr>
                     <a:xfrm>
                       <a:off x="0" y="0"/>
-                      <a:ext cx="5943600" cy="2649619"/>
+                      <a:ext cx="6138731" cy="2863586"/>
                     </a:xfrm>
-                    <a:prstGeom prst="rect"/>
+                    <a:prstGeom prst="rect">
+                      <a:avLst/>
+                    </a:prstGeom>
                   </pic:spPr>
                 </pic:pic>
               </a:graphicData>
@@ -805,6 +811,7 @@
         <w:rPr>
           <w:color w:val="3C3C3C"/>
         </w:rPr>
+        <w:lastRenderedPageBreak/>
         <w:t>Adapted from standard audio models in the Qualcomm AI Hub catalog.</w:t>
       </w:r>
     </w:p>
@@ -949,7 +956,6 @@
           <w:color w:val="32466E"/>
           <w:sz w:val="22"/>
         </w:rPr>
-        <w:lastRenderedPageBreak/>
         <w:t>D. Hardware Alert with Arduino UNO Q</w:t>
       </w:r>
     </w:p>
@@ -1259,6 +1265,27 @@
     </w:p>
     <w:p>
       <w:pPr>
+        <w:pStyle w:val="ListBullet"/>
+      </w:pPr>
+      <w:r>
+        <w:rPr>
+          <w:rFonts w:ascii="Segoe UI" w:hAnsi="Segoe UI"/>
+          <w:color w:val="3C3C3C"/>
+          <w:sz w:val="20"/>
+        </w:rPr>
+        <w:t xml:space="preserve">Testing &amp; Accessibility: </w:t>
+      </w:r>
+      <w:r>
+        <w:rPr>
+          <w:rFonts w:ascii="Segoe UI" w:hAnsi="Segoe UI"/>
+          <w:color w:val="3C3C3C"/>
+          <w:sz w:val="20"/>
+        </w:rPr>
+        <w:t>Includes a built-in CPU fallback and hardware simulation mode so evaluators can run and verify the codebase on standard PCs.</w:t>
+      </w:r>
+    </w:p>
+    <w:p>
+      <w:pPr>
         <w:pBdr>
           <w:bottom w:val="single" w:sz="4" w:space="1" w:color="C0C8D0"/>
         </w:pBdr>
@@ -1292,6 +1319,7 @@
           <w:bCs/>
           <w:color w:val="3C3C3C"/>
         </w:rPr>
+        <w:lastRenderedPageBreak/>
         <w:t>Slide Deck:</w:t>
       </w:r>
       <w:r>

</xml_diff>

<commit_message>
Bold all bullet lead-in prefixes and add clean breathing room to headings
</commit_message>
<xml_diff>
--- a/submission_assets/VoiceArmor_Edge_Proposal.docx
+++ b/submission_assets/VoiceArmor_Edge_Proposal.docx
@@ -13,35 +13,20 @@
           <w:color w:val="1954A6"/>
           <w:sz w:val="36"/>
         </w:rPr>
-        <w:t xml:space="preserve">Project Proposal: </w:t>
-      </w:r>
-      <w:proofErr w:type="spellStart"/>
-      <w:r>
-        <w:rPr>
-          <w:b/>
-          <w:color w:val="1954A6"/>
-          <w:sz w:val="36"/>
-        </w:rPr>
-        <w:t>VoiceArmor</w:t>
-      </w:r>
-      <w:proofErr w:type="spellEnd"/>
-      <w:r>
-        <w:rPr>
-          <w:b/>
-          <w:color w:val="1954A6"/>
-          <w:sz w:val="36"/>
-        </w:rPr>
-        <w:t>-Edge</w:t>
+        <w:t>Project Proposal: VoiceArmor-Edge</w:t>
       </w:r>
     </w:p>
     <w:p>
       <w:pPr>
         <w:spacing w:line="360" w:lineRule="auto"/>
         <w:jc w:val="center"/>
+        <w:rPr>
+          <w:color w:val="auto"/>
+        </w:rPr>
       </w:pPr>
       <w:r>
         <w:rPr>
-          <w:color w:val="3C3C3C"/>
+          <w:color w:val="auto"/>
           <w:sz w:val="22"/>
         </w:rPr>
         <w:t>Real-Time On-Device Voice Spoof &amp; Synthetic Call Detection</w:t>
@@ -51,35 +36,45 @@
       <w:pPr>
         <w:spacing w:line="360" w:lineRule="auto"/>
         <w:jc w:val="center"/>
+        <w:rPr>
+          <w:color w:val="auto"/>
+        </w:rPr>
       </w:pPr>
       <w:r>
         <w:rPr>
-          <w:color w:val="3C3C3C"/>
+          <w:color w:val="auto"/>
           <w:sz w:val="22"/>
         </w:rPr>
         <w:t>for Snapdragon-Powered HP PCs</w:t>
       </w:r>
     </w:p>
-    <w:p/>
+    <w:p>
+      <w:pPr>
+        <w:rPr>
+          <w:color w:val="auto"/>
+        </w:rPr>
+      </w:pPr>
+    </w:p>
     <w:p>
       <w:pPr>
         <w:spacing w:line="360" w:lineRule="auto"/>
         <w:jc w:val="both"/>
         <w:rPr>
+          <w:color w:val="auto"/>
           <w:szCs w:val="20"/>
         </w:rPr>
       </w:pPr>
       <w:r>
         <w:rPr>
           <w:b/>
-          <w:color w:val="1E1E1E"/>
+          <w:color w:val="auto"/>
           <w:szCs w:val="20"/>
         </w:rPr>
         <w:t xml:space="preserve">Challenge: </w:t>
       </w:r>
       <w:r>
         <w:rPr>
-          <w:color w:val="3C3C3C"/>
+          <w:color w:val="auto"/>
           <w:szCs w:val="20"/>
         </w:rPr>
         <w:t>Snapdragon AI Lab Build &amp; Present Challenge 2026</w:t>
@@ -90,20 +85,21 @@
         <w:spacing w:line="360" w:lineRule="auto"/>
         <w:jc w:val="both"/>
         <w:rPr>
+          <w:color w:val="auto"/>
           <w:szCs w:val="20"/>
         </w:rPr>
       </w:pPr>
       <w:r>
         <w:rPr>
           <w:b/>
-          <w:color w:val="1E1E1E"/>
+          <w:color w:val="auto"/>
           <w:szCs w:val="20"/>
         </w:rPr>
         <w:t xml:space="preserve">Participant: </w:t>
       </w:r>
       <w:r>
         <w:rPr>
-          <w:color w:val="3C3C3C"/>
+          <w:color w:val="auto"/>
           <w:szCs w:val="20"/>
         </w:rPr>
         <w:t>Bharath G Devadiga</w:t>
@@ -114,20 +110,21 @@
         <w:spacing w:line="360" w:lineRule="auto"/>
         <w:jc w:val="both"/>
         <w:rPr>
+          <w:color w:val="auto"/>
           <w:szCs w:val="20"/>
         </w:rPr>
       </w:pPr>
       <w:r>
         <w:rPr>
           <w:b/>
-          <w:color w:val="1E1E1E"/>
+          <w:color w:val="auto"/>
           <w:szCs w:val="20"/>
         </w:rPr>
         <w:t xml:space="preserve">Email: </w:t>
       </w:r>
       <w:r>
         <w:rPr>
-          <w:color w:val="3C3C3C"/>
+          <w:color w:val="auto"/>
           <w:szCs w:val="20"/>
         </w:rPr>
         <w:t>bharath.23ec014@sode-edu.in</w:t>
@@ -138,20 +135,21 @@
         <w:spacing w:line="360" w:lineRule="auto"/>
         <w:jc w:val="both"/>
         <w:rPr>
+          <w:color w:val="auto"/>
           <w:szCs w:val="20"/>
         </w:rPr>
       </w:pPr>
       <w:r>
         <w:rPr>
           <w:b/>
-          <w:color w:val="1E1E1E"/>
+          <w:color w:val="auto"/>
           <w:szCs w:val="20"/>
         </w:rPr>
         <w:t xml:space="preserve">Discipline: </w:t>
       </w:r>
       <w:r>
         <w:rPr>
-          <w:color w:val="3C3C3C"/>
+          <w:color w:val="auto"/>
           <w:szCs w:val="20"/>
         </w:rPr>
         <w:t>Electronics &amp; Communication Engineering (ECE)</w:t>
@@ -162,20 +160,21 @@
         <w:spacing w:line="360" w:lineRule="auto"/>
         <w:jc w:val="both"/>
         <w:rPr>
+          <w:color w:val="auto"/>
           <w:szCs w:val="20"/>
         </w:rPr>
       </w:pPr>
       <w:r>
         <w:rPr>
           <w:b/>
-          <w:color w:val="1E1E1E"/>
+          <w:color w:val="auto"/>
           <w:szCs w:val="20"/>
         </w:rPr>
         <w:t xml:space="preserve">Target Hardware: </w:t>
       </w:r>
       <w:r>
         <w:rPr>
-          <w:color w:val="3C3C3C"/>
+          <w:color w:val="auto"/>
           <w:szCs w:val="20"/>
         </w:rPr>
         <w:t>Snapdragon X HP OmniBook PCs (Hexagon NPU) + Arduino UNO Q</w:t>
@@ -206,10 +205,13 @@
       <w:pPr>
         <w:spacing w:line="360" w:lineRule="auto"/>
         <w:jc w:val="both"/>
+        <w:rPr>
+          <w:color w:val="auto"/>
+        </w:rPr>
       </w:pPr>
       <w:r>
         <w:rPr>
-          <w:color w:val="3C3C3C"/>
+          <w:color w:val="auto"/>
         </w:rPr>
         <w:t>AI tools can now clone a person's voice using just a short 3-second recording. Scammers are using these cloned voices to impersonate police officers, bank officials or family members to steal money -- a major issue right now with "Digital Arrest" scams in India.</w:t>
       </w:r>
@@ -218,10 +220,13 @@
       <w:pPr>
         <w:spacing w:after="0" w:line="360" w:lineRule="auto"/>
         <w:jc w:val="both"/>
+        <w:rPr>
+          <w:color w:val="auto"/>
+        </w:rPr>
       </w:pPr>
       <w:r>
         <w:rPr>
-          <w:color w:val="3C3C3C"/>
+          <w:color w:val="auto"/>
         </w:rPr>
         <w:t>Current solutions rely on cloud servers to analyze audio. This does not work for live calls:</w:t>
       </w:r>
@@ -235,10 +240,13 @@
         </w:numPr>
         <w:spacing w:line="360" w:lineRule="auto"/>
         <w:jc w:val="both"/>
+        <w:rPr>
+          <w:color w:val="auto"/>
+        </w:rPr>
       </w:pPr>
       <w:r>
         <w:rPr>
-          <w:color w:val="3C3C3C"/>
+          <w:color w:val="auto"/>
         </w:rPr>
         <w:t>Sending call audio over the internet is too slow to warn someone in real time.</w:t>
       </w:r>
@@ -252,10 +260,13 @@
         </w:numPr>
         <w:spacing w:line="360" w:lineRule="auto"/>
         <w:jc w:val="both"/>
+        <w:rPr>
+          <w:color w:val="auto"/>
+        </w:rPr>
       </w:pPr>
       <w:r>
         <w:rPr>
-          <w:color w:val="3C3C3C"/>
+          <w:color w:val="auto"/>
         </w:rPr>
         <w:t>It requires an internet connection and leaks private conversations.</w:t>
       </w:r>
@@ -269,10 +280,13 @@
         </w:numPr>
         <w:spacing w:line="360" w:lineRule="auto"/>
         <w:jc w:val="both"/>
+        <w:rPr>
+          <w:color w:val="auto"/>
+        </w:rPr>
       </w:pPr>
       <w:r>
         <w:rPr>
-          <w:color w:val="3C3C3C"/>
+          <w:color w:val="auto"/>
         </w:rPr>
         <w:t>It drains laptop battery and can make video calls laggy.</w:t>
       </w:r>
@@ -281,10 +295,13 @@
       <w:pPr>
         <w:spacing w:line="360" w:lineRule="auto"/>
         <w:jc w:val="both"/>
+        <w:rPr>
+          <w:color w:val="auto"/>
+        </w:rPr>
       </w:pPr>
       <w:r>
         <w:rPr>
-          <w:color w:val="3C3C3C"/>
+          <w:color w:val="auto"/>
         </w:rPr>
         <w:t>VoiceArmor-Edge solves this by running entirely on the laptop using the Snapdragon Hexagon NPU. It listens to incoming call audio in short 250ms chunks, converts sound into frequency pictures (spectrograms) and runs a lightweight AI model to check if the voice is real or fake in under 15ms.</w:t>
       </w:r>
@@ -293,10 +310,13 @@
       <w:pPr>
         <w:spacing w:line="360" w:lineRule="auto"/>
         <w:jc w:val="both"/>
+        <w:rPr>
+          <w:color w:val="auto"/>
+        </w:rPr>
       </w:pPr>
       <w:r>
         <w:rPr>
-          <w:color w:val="3C3C3C"/>
+          <w:color w:val="auto"/>
         </w:rPr>
         <w:t>It also connects via USB to an Arduino UNO Q board. If a fake voice is detected, the Arduino turns on a red warning light and buzzer -- a physical warning the user cannot miss.</w:t>
       </w:r>
@@ -324,7 +344,7 @@
     </w:p>
     <w:p>
       <w:pPr>
-        <w:spacing w:line="360" w:lineRule="auto"/>
+        <w:spacing w:line="360" w:lineRule="auto" w:before="120" w:after="80"/>
         <w:jc w:val="both"/>
       </w:pPr>
       <w:r>
@@ -345,12 +365,23 @@
         </w:numPr>
         <w:spacing w:line="360" w:lineRule="auto"/>
         <w:jc w:val="both"/>
+        <w:rPr>
+          <w:color w:val="auto"/>
+        </w:rPr>
       </w:pPr>
       <w:r>
         <w:rPr>
-          <w:color w:val="3C3C3C"/>
-        </w:rPr>
-        <w:t>Voice Cloning Fraud: Fraudsters call victims pretending to be law enforcement or family members in distress, demanding urgent bank transfers.</w:t>
+          <w:b/>
+          <w:bCs/>
+          <w:color w:val="auto"/>
+        </w:rPr>
+        <w:t>Voice Cloning Fraud:</w:t>
+      </w:r>
+      <w:r>
+        <w:rPr>
+          <w:color w:val="auto"/>
+        </w:rPr>
+        <w:t xml:space="preserve"> Fraudsters call victims pretending to be law enforcement or family members in distress, demanding urgent bank transfers.</w:t>
       </w:r>
     </w:p>
     <w:p>
@@ -362,12 +393,23 @@
         </w:numPr>
         <w:spacing w:line="360" w:lineRule="auto"/>
         <w:jc w:val="both"/>
+        <w:rPr>
+          <w:color w:val="auto"/>
+        </w:rPr>
       </w:pPr>
       <w:r>
         <w:rPr>
-          <w:color w:val="3C3C3C"/>
-        </w:rPr>
-        <w:t>No Protection on Meeting Apps: Microsoft Teams, Zoom and WhatsApp Desktop have no built-in way to check if a voice is human or AI-generated.</w:t>
+          <w:b/>
+          <w:bCs/>
+          <w:color w:val="auto"/>
+        </w:rPr>
+        <w:t>No Protection on Meeting Apps:</w:t>
+      </w:r>
+      <w:r>
+        <w:rPr>
+          <w:color w:val="auto"/>
+        </w:rPr>
+        <w:t xml:space="preserve"> Microsoft Teams, Zoom and WhatsApp Desktop have no built-in way to check if a voice is human or AI-generated.</w:t>
       </w:r>
     </w:p>
     <w:p>
@@ -383,7 +425,7 @@
     </w:p>
     <w:p>
       <w:pPr>
-        <w:spacing w:line="360" w:lineRule="auto"/>
+        <w:spacing w:line="360" w:lineRule="auto" w:before="120" w:after="80"/>
         <w:jc w:val="both"/>
       </w:pPr>
       <w:r>
@@ -405,18 +447,21 @@
         </w:numPr>
         <w:spacing w:line="360" w:lineRule="auto"/>
         <w:jc w:val="both"/>
+        <w:rPr>
+          <w:color w:val="auto"/>
+        </w:rPr>
       </w:pPr>
       <w:r>
         <w:rPr>
           <w:b/>
           <w:bCs/>
-          <w:color w:val="3C3C3C"/>
+          <w:color w:val="auto"/>
         </w:rPr>
         <w:t>Fast Response:</w:t>
       </w:r>
       <w:r>
         <w:rPr>
-          <w:color w:val="3C3C3C"/>
+          <w:color w:val="auto"/>
         </w:rPr>
         <w:t xml:space="preserve"> The NPU checks speech in under 15ms, warning the user while the caller is still speaking.</w:t>
       </w:r>
@@ -430,18 +475,21 @@
         </w:numPr>
         <w:spacing w:line="360" w:lineRule="auto"/>
         <w:jc w:val="both"/>
+        <w:rPr>
+          <w:color w:val="auto"/>
+        </w:rPr>
       </w:pPr>
       <w:r>
         <w:rPr>
           <w:b/>
           <w:bCs/>
-          <w:color w:val="3C3C3C"/>
+          <w:color w:val="auto"/>
         </w:rPr>
         <w:t>Complete Privacy</w:t>
       </w:r>
       <w:r>
         <w:rPr>
-          <w:color w:val="3C3C3C"/>
+          <w:color w:val="auto"/>
         </w:rPr>
         <w:t>: Audio never leaves the laptop. Works 100% offline, even in Airplane Mode.</w:t>
       </w:r>
@@ -455,18 +503,21 @@
         </w:numPr>
         <w:spacing w:line="360" w:lineRule="auto"/>
         <w:jc w:val="both"/>
+        <w:rPr>
+          <w:color w:val="auto"/>
+        </w:rPr>
       </w:pPr>
       <w:r>
         <w:rPr>
           <w:b/>
           <w:bCs/>
-          <w:color w:val="3C3C3C"/>
+          <w:color w:val="auto"/>
         </w:rPr>
         <w:t>No Video Call Lag:</w:t>
       </w:r>
       <w:r>
         <w:rPr>
-          <w:color w:val="3C3C3C"/>
+          <w:color w:val="auto"/>
         </w:rPr>
         <w:t xml:space="preserve"> The NPU handles AI work, leaving CPU and GPU free for the video call.</w:t>
       </w:r>
@@ -480,18 +531,21 @@
         </w:numPr>
         <w:spacing w:line="360" w:lineRule="auto"/>
         <w:jc w:val="both"/>
+        <w:rPr>
+          <w:color w:val="auto"/>
+        </w:rPr>
       </w:pPr>
       <w:r>
         <w:rPr>
           <w:b/>
           <w:bCs/>
-          <w:color w:val="3C3C3C"/>
+          <w:color w:val="auto"/>
         </w:rPr>
         <w:t>Low Battery Drain:</w:t>
       </w:r>
       <w:r>
         <w:rPr>
-          <w:color w:val="3C3C3C"/>
+          <w:color w:val="auto"/>
         </w:rPr>
         <w:t xml:space="preserve"> The NPU uses very little power, runs quietly in the background all day.</w:t>
       </w:r>
@@ -506,7 +560,7 @@
     </w:p>
     <w:p>
       <w:pPr>
-        <w:spacing w:line="360" w:lineRule="auto"/>
+        <w:spacing w:line="360" w:lineRule="auto" w:before="160" w:after="80"/>
         <w:jc w:val="both"/>
       </w:pPr>
       <w:r>
@@ -520,7 +574,7 @@
     </w:p>
     <w:p>
       <w:pPr>
-        <w:spacing w:line="360" w:lineRule="auto"/>
+        <w:spacing w:line="360" w:lineRule="auto" w:before="100" w:after="80"/>
         <w:jc w:val="both"/>
       </w:pPr>
       <w:r>
@@ -534,12 +588,15 @@
     </w:p>
     <w:p>
       <w:pPr>
-        <w:spacing w:after="0" w:line="360" w:lineRule="auto"/>
+        <w:spacing w:after="80" w:line="360" w:lineRule="auto" w:before="40"/>
         <w:jc w:val="both"/>
+        <w:rPr>
+          <w:color w:val="auto"/>
+        </w:rPr>
       </w:pPr>
       <w:r>
         <w:rPr>
-          <w:color w:val="3C3C3C"/>
+          <w:color w:val="auto"/>
         </w:rPr>
         <w:t>The system follows a 4-step pipeline:</w:t>
       </w:r>
@@ -553,48 +610,28 @@
         </w:numPr>
         <w:spacing w:line="360" w:lineRule="auto"/>
         <w:jc w:val="both"/>
-      </w:pPr>
+        <w:rPr>
+          <w:color w:val="auto"/>
+        </w:rPr>
+      </w:pPr>
+      <w:r/>
       <w:r>
         <w:rPr>
-          <w:color w:val="3C3C3C"/>
-        </w:rPr>
-        <w:t>Step</w:t>
+          <w:rFonts w:ascii="Segoe UI" w:hAnsi="Segoe UI"/>
+          <w:b/>
+          <w:color w:val="323232"/>
+          <w:sz w:val="20"/>
+        </w:rPr>
+        <w:t>Step 1 - Audio DSP Pipeline:</w:t>
       </w:r>
       <w:r>
         <w:rPr>
+          <w:rFonts w:ascii="Segoe UI" w:hAnsi="Segoe UI"/>
+          <w:b w:val="0"/>
           <w:color w:val="3C3C3C"/>
-        </w:rPr>
-        <w:t xml:space="preserve"> </w:t>
-      </w:r>
-      <w:r>
-        <w:rPr>
-          <w:color w:val="3C3C3C"/>
-        </w:rPr>
-        <w:t>1</w:t>
-      </w:r>
-      <w:r>
-        <w:rPr>
-          <w:color w:val="3C3C3C"/>
-        </w:rPr>
-        <w:t xml:space="preserve"> </w:t>
-      </w:r>
-      <w:r>
-        <w:rPr>
-          <w:color w:val="3C3C3C"/>
-        </w:rPr>
-        <w:t>-</w:t>
-      </w:r>
-      <w:r>
-        <w:rPr>
-          <w:color w:val="3C3C3C"/>
-        </w:rPr>
-        <w:t xml:space="preserve"> </w:t>
-      </w:r>
-      <w:r>
-        <w:rPr>
-          <w:color w:val="3C3C3C"/>
-        </w:rPr>
-        <w:t>Audio DSP Pipeline: Takes 250ms audio chunks at 16 kHz and produces a 64-band Mel Spectrogram.</w:t>
+          <w:sz w:val="20"/>
+        </w:rPr>
+        <w:t xml:space="preserve"> Takes 250ms audio chunks at 16 kHz and produces a 64-band Mel Spectrogram.</w:t>
       </w:r>
     </w:p>
     <w:p>
@@ -606,12 +643,28 @@
         </w:numPr>
         <w:spacing w:line="360" w:lineRule="auto"/>
         <w:jc w:val="both"/>
-      </w:pPr>
+        <w:rPr>
+          <w:color w:val="auto"/>
+        </w:rPr>
+      </w:pPr>
+      <w:r/>
       <w:r>
         <w:rPr>
+          <w:rFonts w:ascii="Segoe UI" w:hAnsi="Segoe UI"/>
+          <w:b/>
+          <w:color w:val="323232"/>
+          <w:sz w:val="20"/>
+        </w:rPr>
+        <w:t>Step 2 - Qualcomm AI Hub Model:</w:t>
+      </w:r>
+      <w:r>
+        <w:rPr>
+          <w:rFonts w:ascii="Segoe UI" w:hAnsi="Segoe UI"/>
+          <w:b w:val="0"/>
           <w:color w:val="3C3C3C"/>
-        </w:rPr>
-        <w:t>Step 2 - Qualcomm AI Hub Model: INT8 quantized CNN classifier compiled with qai-hub toolchain.</w:t>
+          <w:sz w:val="20"/>
+        </w:rPr>
+        <w:t xml:space="preserve"> INT8 quantized CNN classifier compiled with qai-hub toolchain.</w:t>
       </w:r>
     </w:p>
     <w:p>
@@ -623,12 +676,28 @@
         </w:numPr>
         <w:spacing w:line="360" w:lineRule="auto"/>
         <w:jc w:val="both"/>
-      </w:pPr>
+        <w:rPr>
+          <w:color w:val="auto"/>
+        </w:rPr>
+      </w:pPr>
+      <w:r/>
       <w:r>
         <w:rPr>
+          <w:rFonts w:ascii="Segoe UI" w:hAnsi="Segoe UI"/>
+          <w:b/>
+          <w:color w:val="323232"/>
+          <w:sz w:val="20"/>
+        </w:rPr>
+        <w:t>Step 3 - Hexagon NPU Inference:</w:t>
+      </w:r>
+      <w:r>
+        <w:rPr>
+          <w:rFonts w:ascii="Segoe UI" w:hAnsi="Segoe UI"/>
+          <w:b w:val="0"/>
           <w:color w:val="3C3C3C"/>
-        </w:rPr>
-        <w:t>Step 3 - Hexagon NPU Inference: Runs via ONNX Runtime + QnnHtp.dll with under 15ms latency.</w:t>
+          <w:sz w:val="20"/>
+        </w:rPr>
+        <w:t xml:space="preserve"> Runs via ONNX Runtime + QnnHtp.dll with under 15ms latency.</w:t>
       </w:r>
     </w:p>
     <w:p>
@@ -640,12 +709,28 @@
         </w:numPr>
         <w:spacing w:line="360" w:lineRule="auto"/>
         <w:jc w:val="both"/>
-      </w:pPr>
+        <w:rPr>
+          <w:color w:val="auto"/>
+        </w:rPr>
+      </w:pPr>
+      <w:r/>
       <w:r>
         <w:rPr>
+          <w:rFonts w:ascii="Segoe UI" w:hAnsi="Segoe UI"/>
+          <w:b/>
+          <w:color w:val="323232"/>
+          <w:sz w:val="20"/>
+        </w:rPr>
+        <w:t>Step 4 - Alert System:</w:t>
+      </w:r>
+      <w:r>
+        <w:rPr>
+          <w:rFonts w:ascii="Segoe UI" w:hAnsi="Segoe UI"/>
+          <w:b w:val="0"/>
           <w:color w:val="3C3C3C"/>
-        </w:rPr>
-        <w:t>Step 4 - Alert System: Windows notification + Arduino UNO Q red LED and buzzer.</w:t>
+          <w:sz w:val="20"/>
+        </w:rPr>
+        <w:t xml:space="preserve"> Windows notification + Arduino UNO Q red LED and buzzer.</w:t>
       </w:r>
     </w:p>
     <w:p>
@@ -657,9 +742,9 @@
           <w:noProof/>
         </w:rPr>
         <w:drawing>
-          <wp:inline distT="0" distB="0" distL="0" distR="0" wp14:anchorId="0409A478" wp14:editId="3D170956">
-            <wp:extent cx="6106453" cy="2848529"/>
-            <wp:effectExtent l="0" t="0" r="0" b="0"/>
+          <wp:inline distT="0" distB="0" distL="0" distR="0" wp14:anchorId="0409A478" wp14:editId="77DCC45F">
+            <wp:extent cx="6242050" cy="2964180"/>
+            <wp:effectExtent l="0" t="0" r="6350" b="0"/>
             <wp:docPr id="1" name="Picture 1"/>
             <wp:cNvGraphicFramePr>
               <a:graphicFrameLocks xmlns:a="http://schemas.openxmlformats.org/drawingml/2006/main" noChangeAspect="1"/>
@@ -680,7 +765,7 @@
                   <pic:spPr>
                     <a:xfrm>
                       <a:off x="0" y="0"/>
-                      <a:ext cx="6138731" cy="2863586"/>
+                      <a:ext cx="6278536" cy="2981506"/>
                     </a:xfrm>
                     <a:prstGeom prst="rect">
                       <a:avLst/>
@@ -696,11 +781,15 @@
     <w:p>
       <w:pPr>
         <w:jc w:val="center"/>
+        <w:rPr>
+          <w:iCs/>
+          <w:color w:val="auto"/>
+        </w:rPr>
       </w:pPr>
       <w:r>
         <w:rPr>
-          <w:i/>
-          <w:color w:val="646464"/>
+          <w:iCs/>
+          <w:color w:val="auto"/>
           <w:sz w:val="18"/>
         </w:rPr>
         <w:t>Figure 1: VoiceArmor-Edge End-to-End System Architecture</w:t>
@@ -708,7 +797,7 @@
     </w:p>
     <w:p>
       <w:pPr>
-        <w:spacing w:line="360" w:lineRule="auto"/>
+        <w:spacing w:before="240" w:line="360" w:lineRule="auto"/>
         <w:jc w:val="both"/>
       </w:pPr>
       <w:r>
@@ -724,10 +813,13 @@
       <w:pPr>
         <w:spacing w:after="0" w:line="360" w:lineRule="auto"/>
         <w:jc w:val="both"/>
+        <w:rPr>
+          <w:color w:val="auto"/>
+        </w:rPr>
       </w:pPr>
       <w:r>
         <w:rPr>
-          <w:color w:val="3C3C3C"/>
+          <w:color w:val="auto"/>
         </w:rPr>
         <w:t>When AI tools generate fake speech, they leave subtle irregularities in higher frequencies that natural human vocal cords do not produce.</w:t>
       </w:r>
@@ -741,10 +833,13 @@
         </w:numPr>
         <w:spacing w:line="360" w:lineRule="auto"/>
         <w:jc w:val="both"/>
+        <w:rPr>
+          <w:color w:val="auto"/>
+        </w:rPr>
       </w:pPr>
       <w:r>
         <w:rPr>
-          <w:color w:val="3C3C3C"/>
+          <w:color w:val="auto"/>
         </w:rPr>
         <w:t>Captures audio from the computer's audio output in real time.</w:t>
       </w:r>
@@ -758,10 +853,13 @@
         </w:numPr>
         <w:spacing w:line="360" w:lineRule="auto"/>
         <w:jc w:val="both"/>
+        <w:rPr>
+          <w:color w:val="auto"/>
+        </w:rPr>
       </w:pPr>
       <w:r>
         <w:rPr>
-          <w:color w:val="3C3C3C"/>
+          <w:color w:val="auto"/>
         </w:rPr>
         <w:t>Slices sound into 250ms chunks and generates a Log-Mel Spectrogram (a visual representation of sound frequencies over time).</w:t>
       </w:r>
@@ -775,10 +873,13 @@
         </w:numPr>
         <w:spacing w:line="360" w:lineRule="auto"/>
         <w:jc w:val="both"/>
+        <w:rPr>
+          <w:color w:val="auto"/>
+        </w:rPr>
       </w:pPr>
       <w:r>
         <w:rPr>
-          <w:color w:val="3C3C3C"/>
+          <w:color w:val="auto"/>
         </w:rPr>
         <w:t>Runs on the CPU and passes the data straight to the NPU.</w:t>
       </w:r>
@@ -794,6 +895,7 @@
           <w:color w:val="32466E"/>
           <w:sz w:val="22"/>
         </w:rPr>
+        <w:lastRenderedPageBreak/>
         <w:t>B. Qualcomm AI Hub Model</w:t>
       </w:r>
     </w:p>
@@ -806,12 +908,14 @@
         </w:numPr>
         <w:spacing w:line="360" w:lineRule="auto"/>
         <w:jc w:val="both"/>
+        <w:rPr>
+          <w:color w:val="auto"/>
+        </w:rPr>
       </w:pPr>
       <w:r>
         <w:rPr>
-          <w:color w:val="3C3C3C"/>
-        </w:rPr>
-        <w:lastRenderedPageBreak/>
+          <w:color w:val="auto"/>
+        </w:rPr>
         <w:t>Adapted from standard audio models in the Qualcomm AI Hub catalog.</w:t>
       </w:r>
     </w:p>
@@ -824,12 +928,28 @@
         </w:numPr>
         <w:spacing w:line="360" w:lineRule="auto"/>
         <w:jc w:val="both"/>
-      </w:pPr>
+        <w:rPr>
+          <w:color w:val="auto"/>
+        </w:rPr>
+      </w:pPr>
+      <w:r/>
       <w:r>
         <w:rPr>
+          <w:rFonts w:ascii="Segoe UI" w:hAnsi="Segoe UI"/>
+          <w:b/>
+          <w:color w:val="323232"/>
+          <w:sz w:val="20"/>
+        </w:rPr>
+        <w:t>INT8 Quantization:</w:t>
+      </w:r>
+      <w:r>
+        <w:rPr>
+          <w:rFonts w:ascii="Segoe UI" w:hAnsi="Segoe UI"/>
+          <w:b w:val="0"/>
           <w:color w:val="3C3C3C"/>
-        </w:rPr>
-        <w:t>INT8 Quantization: Weights converted from 32-bit to 8-bit integers for fast NPU processing with minimal accuracy loss.</w:t>
+          <w:sz w:val="20"/>
+        </w:rPr>
+        <w:t xml:space="preserve"> Weights converted from 32-bit to 8-bit integers for fast NPU processing with minimal accuracy loss.</w:t>
       </w:r>
     </w:p>
     <w:p>
@@ -841,10 +961,13 @@
         </w:numPr>
         <w:spacing w:line="360" w:lineRule="auto"/>
         <w:jc w:val="both"/>
+        <w:rPr>
+          <w:color w:val="auto"/>
+        </w:rPr>
       </w:pPr>
       <w:r>
         <w:rPr>
-          <w:color w:val="3C3C3C"/>
+          <w:color w:val="auto"/>
         </w:rPr>
         <w:t>Compiled using Qualcomm's qai-hub toolchain for ONNX + QNN acceleration.</w:t>
       </w:r>
@@ -872,10 +995,13 @@
         </w:numPr>
         <w:spacing w:line="360" w:lineRule="auto"/>
         <w:jc w:val="both"/>
+        <w:rPr>
+          <w:color w:val="auto"/>
+        </w:rPr>
       </w:pPr>
       <w:r>
         <w:rPr>
-          <w:color w:val="3C3C3C"/>
+          <w:color w:val="auto"/>
         </w:rPr>
         <w:t>Runs as a native Windows service using onnxruntime with onnxruntime-qnn plugin.</w:t>
       </w:r>
@@ -889,64 +1015,19 @@
         </w:numPr>
         <w:spacing w:line="360" w:lineRule="auto"/>
         <w:jc w:val="both"/>
+        <w:rPr>
+          <w:color w:val="auto"/>
+        </w:rPr>
       </w:pPr>
       <w:r>
         <w:rPr>
-          <w:color w:val="3C3C3C"/>
+          <w:color w:val="auto"/>
         </w:rPr>
         <w:t>Links directly with Qualcomm's QnnHtp.dll driver for Hexagon NPU execution.</w:t>
       </w:r>
     </w:p>
     <w:p>
       <w:pPr>
-        <w:pStyle w:val="ListBullet"/>
-        <w:numPr>
-          <w:ilvl w:val="0"/>
-          <w:numId w:val="0"/>
-        </w:numPr>
-        <w:spacing w:line="360" w:lineRule="auto"/>
-        <w:ind w:left="360" w:hanging="360"/>
-        <w:jc w:val="both"/>
-      </w:pPr>
-    </w:p>
-    <w:p>
-      <w:pPr>
-        <w:pStyle w:val="ListBullet"/>
-        <w:numPr>
-          <w:ilvl w:val="0"/>
-          <w:numId w:val="0"/>
-        </w:numPr>
-        <w:spacing w:line="360" w:lineRule="auto"/>
-        <w:ind w:left="360" w:hanging="360"/>
-        <w:jc w:val="both"/>
-      </w:pPr>
-    </w:p>
-    <w:p>
-      <w:pPr>
-        <w:pStyle w:val="ListBullet"/>
-        <w:numPr>
-          <w:ilvl w:val="0"/>
-          <w:numId w:val="0"/>
-        </w:numPr>
-        <w:spacing w:line="360" w:lineRule="auto"/>
-        <w:ind w:left="360" w:hanging="360"/>
-        <w:jc w:val="both"/>
-      </w:pPr>
-    </w:p>
-    <w:p>
-      <w:pPr>
-        <w:pStyle w:val="ListBullet"/>
-        <w:numPr>
-          <w:ilvl w:val="0"/>
-          <w:numId w:val="0"/>
-        </w:numPr>
-        <w:spacing w:line="360" w:lineRule="auto"/>
-        <w:ind w:left="360" w:hanging="360"/>
-        <w:jc w:val="both"/>
-      </w:pPr>
-    </w:p>
-    <w:p>
-      <w:pPr>
         <w:spacing w:line="360" w:lineRule="auto"/>
         <w:jc w:val="both"/>
       </w:pPr>
@@ -963,10 +1044,13 @@
       <w:pPr>
         <w:spacing w:line="360" w:lineRule="auto"/>
         <w:jc w:val="both"/>
+        <w:rPr>
+          <w:color w:val="auto"/>
+        </w:rPr>
       </w:pPr>
       <w:r>
         <w:rPr>
-          <w:color w:val="3C3C3C"/>
+          <w:color w:val="auto"/>
         </w:rPr>
         <w:t>In line with the Snapdragon AI Lab setup:</w:t>
       </w:r>
@@ -980,10 +1064,13 @@
         </w:numPr>
         <w:spacing w:line="360" w:lineRule="auto"/>
         <w:jc w:val="both"/>
+        <w:rPr>
+          <w:color w:val="auto"/>
+        </w:rPr>
       </w:pPr>
       <w:r>
         <w:rPr>
-          <w:color w:val="3C3C3C"/>
+          <w:color w:val="auto"/>
         </w:rPr>
         <w:t>The Snapdragon HP PC does the AI computation.</w:t>
       </w:r>
@@ -997,10 +1084,13 @@
         </w:numPr>
         <w:spacing w:line="360" w:lineRule="auto"/>
         <w:jc w:val="both"/>
+        <w:rPr>
+          <w:color w:val="auto"/>
+        </w:rPr>
       </w:pPr>
       <w:r>
         <w:rPr>
-          <w:color w:val="3C3C3C"/>
+          <w:color w:val="auto"/>
         </w:rPr>
         <w:t>Arduino UNO Q connects via USB as a physical out-of-band indicator.</w:t>
       </w:r>
@@ -1014,10 +1104,13 @@
         </w:numPr>
         <w:spacing w:line="360" w:lineRule="auto"/>
         <w:jc w:val="both"/>
+        <w:rPr>
+          <w:color w:val="auto"/>
+        </w:rPr>
       </w:pPr>
       <w:r>
         <w:rPr>
-          <w:color w:val="3C3C3C"/>
+          <w:color w:val="auto"/>
         </w:rPr>
         <w:t>If fake voice detected: PC signals Arduino to turn on red LED and buzzer.</w:t>
       </w:r>
@@ -1031,10 +1124,13 @@
         </w:numPr>
         <w:spacing w:line="360" w:lineRule="auto"/>
         <w:jc w:val="both"/>
+        <w:rPr>
+          <w:color w:val="auto"/>
+        </w:rPr>
       </w:pPr>
       <w:r>
         <w:rPr>
-          <w:color w:val="3C3C3C"/>
+          <w:color w:val="auto"/>
         </w:rPr>
         <w:t>Physical light alerts the user even if screen is covered or minimized.</w:t>
       </w:r>
@@ -1070,18 +1166,21 @@
         </w:numPr>
         <w:spacing w:line="360" w:lineRule="auto"/>
         <w:jc w:val="both"/>
+        <w:rPr>
+          <w:color w:val="auto"/>
+        </w:rPr>
       </w:pPr>
       <w:r>
         <w:rPr>
           <w:b/>
           <w:bCs/>
-          <w:color w:val="3C3C3C"/>
+          <w:color w:val="auto"/>
         </w:rPr>
         <w:t>Practical &amp; Focused:</w:t>
       </w:r>
       <w:r>
         <w:rPr>
-          <w:color w:val="3C3C3C"/>
+          <w:color w:val="auto"/>
         </w:rPr>
         <w:t xml:space="preserve"> Solves one critical problem very well -- live synthetic voice detection.</w:t>
       </w:r>
@@ -1095,18 +1194,21 @@
         </w:numPr>
         <w:spacing w:line="360" w:lineRule="auto"/>
         <w:jc w:val="both"/>
+        <w:rPr>
+          <w:color w:val="auto"/>
+        </w:rPr>
       </w:pPr>
       <w:r>
         <w:rPr>
           <w:b/>
           <w:bCs/>
-          <w:color w:val="3C3C3C"/>
+          <w:color w:val="auto"/>
         </w:rPr>
         <w:t>True Edge Computing:</w:t>
       </w:r>
       <w:r>
         <w:rPr>
-          <w:color w:val="3C3C3C"/>
+          <w:color w:val="auto"/>
         </w:rPr>
         <w:t xml:space="preserve"> Proves why an on-device NPU is needed. Cloud APIs cannot match sub-15ms speed and privacy.</w:t>
       </w:r>
@@ -1120,18 +1222,21 @@
         </w:numPr>
         <w:spacing w:line="360" w:lineRule="auto"/>
         <w:jc w:val="both"/>
+        <w:rPr>
+          <w:color w:val="auto"/>
+        </w:rPr>
       </w:pPr>
       <w:r>
         <w:rPr>
           <w:b/>
           <w:bCs/>
-          <w:color w:val="3C3C3C"/>
+          <w:color w:val="auto"/>
         </w:rPr>
         <w:t>Physical Hardware Safety:</w:t>
       </w:r>
       <w:r>
         <w:rPr>
-          <w:color w:val="3C3C3C"/>
+          <w:color w:val="auto"/>
         </w:rPr>
         <w:t xml:space="preserve"> Bridges software AI with real-world hardware alerts using Arduino UNO Q.</w:t>
       </w:r>
@@ -1163,18 +1268,21 @@
         <w:pStyle w:val="ListBullet"/>
         <w:spacing w:line="360" w:lineRule="auto"/>
         <w:jc w:val="both"/>
+        <w:rPr>
+          <w:color w:val="auto"/>
+        </w:rPr>
       </w:pPr>
       <w:r>
         <w:rPr>
           <w:b/>
           <w:bCs/>
-          <w:color w:val="3C3C3C"/>
+          <w:color w:val="auto"/>
         </w:rPr>
         <w:t>Target:</w:t>
       </w:r>
       <w:r>
         <w:rPr>
-          <w:color w:val="3C3C3C"/>
+          <w:color w:val="auto"/>
         </w:rPr>
         <w:t xml:space="preserve"> HP OmniBook laptops with Snapdragon X Elite / X Plus.</w:t>
       </w:r>
@@ -1184,18 +1292,21 @@
         <w:pStyle w:val="ListBullet"/>
         <w:spacing w:line="360" w:lineRule="auto"/>
         <w:jc w:val="both"/>
+        <w:rPr>
+          <w:color w:val="auto"/>
+        </w:rPr>
       </w:pPr>
       <w:r>
         <w:rPr>
           <w:b/>
           <w:bCs/>
-          <w:color w:val="3C3C3C"/>
+          <w:color w:val="auto"/>
         </w:rPr>
         <w:t>OS:</w:t>
       </w:r>
       <w:r>
         <w:rPr>
-          <w:color w:val="3C3C3C"/>
+          <w:color w:val="auto"/>
         </w:rPr>
         <w:t xml:space="preserve"> Windows 11 on ARM64.</w:t>
       </w:r>
@@ -1205,18 +1316,21 @@
         <w:pStyle w:val="ListBullet"/>
         <w:spacing w:line="360" w:lineRule="auto"/>
         <w:jc w:val="both"/>
+        <w:rPr>
+          <w:color w:val="auto"/>
+        </w:rPr>
       </w:pPr>
       <w:r>
         <w:rPr>
           <w:b/>
           <w:bCs/>
-          <w:color w:val="3C3C3C"/>
+          <w:color w:val="auto"/>
         </w:rPr>
         <w:t>Lightweight:</w:t>
       </w:r>
       <w:r>
         <w:rPr>
-          <w:color w:val="3C3C3C"/>
+          <w:color w:val="auto"/>
         </w:rPr>
         <w:t xml:space="preserve"> Under 120 MB RAM, under 3% CPU.</w:t>
       </w:r>
@@ -1226,18 +1340,21 @@
         <w:pStyle w:val="ListBullet"/>
         <w:spacing w:line="360" w:lineRule="auto"/>
         <w:jc w:val="both"/>
+        <w:rPr>
+          <w:color w:val="auto"/>
+        </w:rPr>
       </w:pPr>
       <w:r>
         <w:rPr>
           <w:b/>
           <w:bCs/>
-          <w:color w:val="3C3C3C"/>
+          <w:color w:val="auto"/>
         </w:rPr>
         <w:t>Works Offline:</w:t>
       </w:r>
       <w:r>
         <w:rPr>
-          <w:color w:val="3C3C3C"/>
+          <w:color w:val="auto"/>
         </w:rPr>
         <w:t xml:space="preserve"> Fully functional in Airplane Mode.</w:t>
       </w:r>
@@ -1247,18 +1364,21 @@
         <w:pStyle w:val="ListBullet"/>
         <w:spacing w:line="360" w:lineRule="auto"/>
         <w:jc w:val="both"/>
+        <w:rPr>
+          <w:color w:val="auto"/>
+        </w:rPr>
       </w:pPr>
       <w:r>
         <w:rPr>
           <w:b/>
           <w:bCs/>
-          <w:color w:val="3C3C3C"/>
+          <w:color w:val="auto"/>
         </w:rPr>
         <w:t>Easy to Use:</w:t>
       </w:r>
       <w:r>
         <w:rPr>
-          <w:color w:val="3C3C3C"/>
+          <w:color w:val="auto"/>
         </w:rPr>
         <w:t xml:space="preserve"> Runs quietly in the system tray, monitors calls automatically.</w:t>
       </w:r>
@@ -1266,22 +1386,28 @@
     <w:p>
       <w:pPr>
         <w:pStyle w:val="ListBullet"/>
-      </w:pPr>
+        <w:rPr>
+          <w:color w:val="auto"/>
+        </w:rPr>
+      </w:pPr>
+      <w:r/>
       <w:r>
         <w:rPr>
           <w:rFonts w:ascii="Segoe UI" w:hAnsi="Segoe UI"/>
+          <w:b/>
+          <w:color w:val="323232"/>
+          <w:sz w:val="20"/>
+        </w:rPr>
+        <w:t>Testing &amp; Accessibility:</w:t>
+      </w:r>
+      <w:r>
+        <w:rPr>
+          <w:rFonts w:ascii="Segoe UI" w:hAnsi="Segoe UI"/>
+          <w:b w:val="0"/>
           <w:color w:val="3C3C3C"/>
           <w:sz w:val="20"/>
         </w:rPr>
-        <w:t xml:space="preserve">Testing &amp; Accessibility: </w:t>
-      </w:r>
-      <w:r>
-        <w:rPr>
-          <w:rFonts w:ascii="Segoe UI" w:hAnsi="Segoe UI"/>
-          <w:color w:val="3C3C3C"/>
-          <w:sz w:val="20"/>
-        </w:rPr>
-        <w:t>Includes a built-in CPU fallback and hardware simulation mode so evaluators can run and verify the codebase on standard PCs.</w:t>
+        <w:t xml:space="preserve"> Includes a built-in CPU fallback and hardware simulation mode so evaluators can run and verify the codebase on standard PCs.</w:t>
       </w:r>
     </w:p>
     <w:p>
@@ -1297,13 +1423,36 @@
       <w:pPr>
         <w:spacing w:line="360" w:lineRule="auto"/>
         <w:jc w:val="both"/>
-      </w:pPr>
-      <w:r>
         <w:rPr>
           <w:b/>
           <w:color w:val="1954A6"/>
           <w:sz w:val="26"/>
         </w:rPr>
+      </w:pPr>
+    </w:p>
+    <w:p>
+      <w:pPr>
+        <w:spacing w:line="360" w:lineRule="auto"/>
+        <w:jc w:val="both"/>
+        <w:rPr>
+          <w:b/>
+          <w:color w:val="1954A6"/>
+          <w:sz w:val="26"/>
+        </w:rPr>
+      </w:pPr>
+    </w:p>
+    <w:p>
+      <w:pPr>
+        <w:spacing w:line="360" w:lineRule="auto"/>
+        <w:jc w:val="both"/>
+      </w:pPr>
+      <w:r>
+        <w:rPr>
+          <w:b/>
+          <w:color w:val="1954A6"/>
+          <w:sz w:val="26"/>
+        </w:rPr>
+        <w:lastRenderedPageBreak/>
         <w:t>6. Project Presentation &amp; Code</w:t>
       </w:r>
     </w:p>
@@ -1312,19 +1461,21 @@
         <w:pStyle w:val="ListBullet"/>
         <w:spacing w:line="360" w:lineRule="auto"/>
         <w:jc w:val="both"/>
+        <w:rPr>
+          <w:color w:val="auto"/>
+        </w:rPr>
       </w:pPr>
       <w:r>
         <w:rPr>
           <w:b/>
           <w:bCs/>
-          <w:color w:val="3C3C3C"/>
-        </w:rPr>
-        <w:lastRenderedPageBreak/>
+          <w:color w:val="auto"/>
+        </w:rPr>
         <w:t>Slide Deck:</w:t>
       </w:r>
       <w:r>
         <w:rPr>
-          <w:color w:val="3C3C3C"/>
+          <w:color w:val="auto"/>
         </w:rPr>
         <w:t xml:space="preserve"> 10-slide presentation covering the problem, architecture, NPU integration and roadmap.</w:t>
       </w:r>
@@ -1334,18 +1485,21 @@
         <w:pStyle w:val="ListBullet"/>
         <w:spacing w:line="360" w:lineRule="auto"/>
         <w:jc w:val="both"/>
+        <w:rPr>
+          <w:color w:val="auto"/>
+        </w:rPr>
       </w:pPr>
       <w:r>
         <w:rPr>
           <w:b/>
           <w:bCs/>
-          <w:color w:val="3C3C3C"/>
+          <w:color w:val="auto"/>
         </w:rPr>
         <w:t>Source Code:</w:t>
       </w:r>
       <w:r>
         <w:rPr>
-          <w:color w:val="3C3C3C"/>
+          <w:color w:val="auto"/>
         </w:rPr>
         <w:t xml:space="preserve"> Full project on GitHub with audio processing pipeline, NPU inference script and Arduino sketch.</w:t>
       </w:r>
@@ -1377,10 +1531,13 @@
       <w:pPr>
         <w:spacing w:line="360" w:lineRule="auto"/>
         <w:jc w:val="both"/>
+        <w:rPr>
+          <w:color w:val="auto"/>
+        </w:rPr>
       </w:pPr>
       <w:r>
         <w:rPr>
-          <w:color w:val="3C3C3C"/>
+          <w:color w:val="auto"/>
         </w:rPr>
         <w:t>VoiceArmor-Edge is a focused and practical project that shows the real value of the Snapdragon Hexagon NPU. By combining digital signal processing, Qualcomm AI Hub model optimization and a physical hardware alert, it protects everyday users from AI voice scams safely and privately on their own laptops.</w:t>
       </w:r>

</xml_diff>

<commit_message>
Add clickable GitHub repository link to info block and Section 6 in Word proposal
</commit_message>
<xml_diff>
--- a/submission_assets/VoiceArmor_Edge_Proposal.docx
+++ b/submission_assets/VoiceArmor_Edge_Proposal.docx
@@ -179,6 +179,28 @@
         </w:rPr>
         <w:t>Snapdragon X HP OmniBook PCs (Hexagon NPU) + Arduino UNO Q</w:t>
       </w:r>
+    </w:p>
+    <w:p>
+      <w:r>
+        <w:rPr>
+          <w:rFonts w:ascii="Segoe UI" w:hAnsi="Segoe UI"/>
+          <w:b/>
+          <w:color w:val="1E1E1E"/>
+          <w:sz w:val="19"/>
+        </w:rPr>
+        <w:t xml:space="preserve">GitHub Repository: </w:t>
+      </w:r>
+      <w:hyperlink r:id="rId9">
+        <w:r>
+          <w:rPr>
+            <w:color w:val="1954A6"/>
+            <w:u w:val="single"/>
+            <w:rFonts w:ascii="Segoe UI" w:hAnsi="Segoe UI"/>
+            <w:sz w:val="19"/>
+          </w:rPr>
+          <w:t>https://github.com/BharathGDevadiga/VoiceArmor-Edge</w:t>
+        </w:r>
+      </w:hyperlink>
     </w:p>
     <w:p>
       <w:pPr>
@@ -344,7 +366,7 @@
     </w:p>
     <w:p>
       <w:pPr>
-        <w:spacing w:line="360" w:lineRule="auto" w:before="120" w:after="80"/>
+        <w:spacing w:before="120" w:line="360" w:lineRule="auto"/>
         <w:jc w:val="both"/>
       </w:pPr>
       <w:r>
@@ -425,7 +447,7 @@
     </w:p>
     <w:p>
       <w:pPr>
-        <w:spacing w:line="360" w:lineRule="auto" w:before="120" w:after="80"/>
+        <w:spacing w:before="120" w:line="360" w:lineRule="auto"/>
         <w:jc w:val="both"/>
       </w:pPr>
       <w:r>
@@ -560,7 +582,7 @@
     </w:p>
     <w:p>
       <w:pPr>
-        <w:spacing w:line="360" w:lineRule="auto" w:before="160" w:after="80"/>
+        <w:spacing w:before="160" w:line="360" w:lineRule="auto"/>
         <w:jc w:val="both"/>
       </w:pPr>
       <w:r>
@@ -574,7 +596,7 @@
     </w:p>
     <w:p>
       <w:pPr>
-        <w:spacing w:line="360" w:lineRule="auto" w:before="100" w:after="80"/>
+        <w:spacing w:before="100" w:line="360" w:lineRule="auto"/>
         <w:jc w:val="both"/>
       </w:pPr>
       <w:r>
@@ -588,7 +610,7 @@
     </w:p>
     <w:p>
       <w:pPr>
-        <w:spacing w:after="80" w:line="360" w:lineRule="auto" w:before="40"/>
+        <w:spacing w:before="40" w:line="360" w:lineRule="auto"/>
         <w:jc w:val="both"/>
         <w:rPr>
           <w:color w:val="auto"/>
@@ -614,22 +636,15 @@
           <w:color w:val="auto"/>
         </w:rPr>
       </w:pPr>
-      <w:r/>
       <w:r>
         <w:rPr>
-          <w:rFonts w:ascii="Segoe UI" w:hAnsi="Segoe UI"/>
           <w:b/>
-          <w:color w:val="323232"/>
-          <w:sz w:val="20"/>
         </w:rPr>
         <w:t>Step 1 - Audio DSP Pipeline:</w:t>
       </w:r>
       <w:r>
         <w:rPr>
-          <w:rFonts w:ascii="Segoe UI" w:hAnsi="Segoe UI"/>
-          <w:b w:val="0"/>
           <w:color w:val="3C3C3C"/>
-          <w:sz w:val="20"/>
         </w:rPr>
         <w:t xml:space="preserve"> Takes 250ms audio chunks at 16 kHz and produces a 64-band Mel Spectrogram.</w:t>
       </w:r>
@@ -647,22 +662,15 @@
           <w:color w:val="auto"/>
         </w:rPr>
       </w:pPr>
-      <w:r/>
       <w:r>
         <w:rPr>
-          <w:rFonts w:ascii="Segoe UI" w:hAnsi="Segoe UI"/>
           <w:b/>
-          <w:color w:val="323232"/>
-          <w:sz w:val="20"/>
         </w:rPr>
         <w:t>Step 2 - Qualcomm AI Hub Model:</w:t>
       </w:r>
       <w:r>
         <w:rPr>
-          <w:rFonts w:ascii="Segoe UI" w:hAnsi="Segoe UI"/>
-          <w:b w:val="0"/>
           <w:color w:val="3C3C3C"/>
-          <w:sz w:val="20"/>
         </w:rPr>
         <w:t xml:space="preserve"> INT8 quantized CNN classifier compiled with qai-hub toolchain.</w:t>
       </w:r>
@@ -680,22 +688,15 @@
           <w:color w:val="auto"/>
         </w:rPr>
       </w:pPr>
-      <w:r/>
       <w:r>
         <w:rPr>
-          <w:rFonts w:ascii="Segoe UI" w:hAnsi="Segoe UI"/>
           <w:b/>
-          <w:color w:val="323232"/>
-          <w:sz w:val="20"/>
         </w:rPr>
         <w:t>Step 3 - Hexagon NPU Inference:</w:t>
       </w:r>
       <w:r>
         <w:rPr>
-          <w:rFonts w:ascii="Segoe UI" w:hAnsi="Segoe UI"/>
-          <w:b w:val="0"/>
           <w:color w:val="3C3C3C"/>
-          <w:sz w:val="20"/>
         </w:rPr>
         <w:t xml:space="preserve"> Runs via ONNX Runtime + QnnHtp.dll with under 15ms latency.</w:t>
       </w:r>
@@ -713,22 +714,15 @@
           <w:color w:val="auto"/>
         </w:rPr>
       </w:pPr>
-      <w:r/>
       <w:r>
         <w:rPr>
-          <w:rFonts w:ascii="Segoe UI" w:hAnsi="Segoe UI"/>
           <w:b/>
-          <w:color w:val="323232"/>
-          <w:sz w:val="20"/>
         </w:rPr>
         <w:t>Step 4 - Alert System:</w:t>
       </w:r>
       <w:r>
         <w:rPr>
-          <w:rFonts w:ascii="Segoe UI" w:hAnsi="Segoe UI"/>
-          <w:b w:val="0"/>
           <w:color w:val="3C3C3C"/>
-          <w:sz w:val="20"/>
         </w:rPr>
         <w:t xml:space="preserve"> Windows notification + Arduino UNO Q red LED and buzzer.</w:t>
       </w:r>
@@ -932,22 +926,15 @@
           <w:color w:val="auto"/>
         </w:rPr>
       </w:pPr>
-      <w:r/>
       <w:r>
         <w:rPr>
-          <w:rFonts w:ascii="Segoe UI" w:hAnsi="Segoe UI"/>
           <w:b/>
-          <w:color w:val="323232"/>
-          <w:sz w:val="20"/>
         </w:rPr>
         <w:t>INT8 Quantization:</w:t>
       </w:r>
       <w:r>
         <w:rPr>
-          <w:rFonts w:ascii="Segoe UI" w:hAnsi="Segoe UI"/>
-          <w:b w:val="0"/>
           <w:color w:val="3C3C3C"/>
-          <w:sz w:val="20"/>
         </w:rPr>
         <w:t xml:space="preserve"> Weights converted from 32-bit to 8-bit integers for fast NPU processing with minimal accuracy loss.</w:t>
       </w:r>
@@ -1390,22 +1377,15 @@
           <w:color w:val="auto"/>
         </w:rPr>
       </w:pPr>
-      <w:r/>
       <w:r>
         <w:rPr>
-          <w:rFonts w:ascii="Segoe UI" w:hAnsi="Segoe UI"/>
           <w:b/>
-          <w:color w:val="323232"/>
-          <w:sz w:val="20"/>
         </w:rPr>
         <w:t>Testing &amp; Accessibility:</w:t>
       </w:r>
       <w:r>
         <w:rPr>
-          <w:rFonts w:ascii="Segoe UI" w:hAnsi="Segoe UI"/>
-          <w:b w:val="0"/>
           <w:color w:val="3C3C3C"/>
-          <w:sz w:val="20"/>
         </w:rPr>
         <w:t xml:space="preserve"> Includes a built-in CPU fallback and hardware simulation mode so evaluators can run and verify the codebase on standard PCs.</w:t>
       </w:r>
@@ -1483,25 +1463,48 @@
     <w:p>
       <w:pPr>
         <w:pStyle w:val="ListBullet"/>
-        <w:spacing w:line="360" w:lineRule="auto"/>
+        <w:spacing w:line="360" w:lineRule="auto" w:after="40"/>
         <w:jc w:val="both"/>
         <w:rPr>
           <w:color w:val="auto"/>
         </w:rPr>
       </w:pPr>
+      <w:r/>
       <w:r>
         <w:rPr>
+          <w:rFonts w:ascii="Segoe UI" w:hAnsi="Segoe UI"/>
           <w:b/>
-          <w:bCs/>
-          <w:color w:val="auto"/>
-        </w:rPr>
-        <w:t>Source Code:</w:t>
+          <w:color w:val="323232"/>
+          <w:sz w:val="20"/>
+        </w:rPr>
+        <w:t xml:space="preserve">Source Code: </w:t>
       </w:r>
       <w:r>
         <w:rPr>
-          <w:color w:val="auto"/>
-        </w:rPr>
-        <w:t xml:space="preserve"> Full project on GitHub with audio processing pipeline, NPU inference script and Arduino sketch.</w:t>
+          <w:rFonts w:ascii="Segoe UI" w:hAnsi="Segoe UI"/>
+          <w:color w:val="3C3C3C"/>
+          <w:sz w:val="20"/>
+        </w:rPr>
+        <w:t>Full project code available on GitHub (</w:t>
+      </w:r>
+      <w:hyperlink r:id="rId9">
+        <w:r>
+          <w:rPr>
+            <w:color w:val="1954A6"/>
+            <w:u w:val="single"/>
+            <w:rFonts w:ascii="Segoe UI" w:hAnsi="Segoe UI"/>
+            <w:sz w:val="19"/>
+          </w:rPr>
+          <w:t>https://github.com/BharathGDevadiga/VoiceArmor-Edge</w:t>
+        </w:r>
+      </w:hyperlink>
+      <w:r>
+        <w:rPr>
+          <w:rFonts w:ascii="Segoe UI" w:hAnsi="Segoe UI"/>
+          <w:color w:val="3C3C3C"/>
+          <w:sz w:val="20"/>
+        </w:rPr>
+        <w:t>) including the audio processing pipeline, NPU inference script and Arduino sketch.</w:t>
       </w:r>
     </w:p>
     <w:p>
@@ -1544,7 +1547,7 @@
     </w:p>
     <w:sectPr>
       <w:pgSz w:w="12240" w:h="15840"/>
-      <w:pgMar w:top="850" w:right="1041" w:bottom="850" w:left="1134" w:header="720" w:footer="720" w:gutter="0"/>
+      <w:pgMar w:top="850" w:right="900" w:bottom="850" w:left="1134" w:header="720" w:footer="720" w:gutter="0"/>
       <w:cols w:space="720"/>
       <w:docGrid w:linePitch="360"/>
     </w:sectPr>

</xml_diff>

<commit_message>
Finalize proposal PDF and docx with vector SVG diagram and updated author metadata
</commit_message>
<xml_diff>
--- a/submission_assets/VoiceArmor_Edge_Proposal.docx
+++ b/submission_assets/VoiceArmor_Edge_Proposal.docx
@@ -183,20 +183,18 @@
     <w:p>
       <w:r>
         <w:rPr>
-          <w:rFonts w:ascii="Segoe UI" w:hAnsi="Segoe UI"/>
           <w:b/>
           <w:color w:val="1E1E1E"/>
           <w:sz w:val="19"/>
         </w:rPr>
         <w:t xml:space="preserve">GitHub Repository: </w:t>
       </w:r>
-      <w:hyperlink r:id="rId9">
+      <w:hyperlink r:id="rId6">
         <w:r>
           <w:rPr>
             <w:color w:val="1954A6"/>
+            <w:sz w:val="19"/>
             <w:u w:val="single"/>
-            <w:rFonts w:ascii="Segoe UI" w:hAnsi="Segoe UI"/>
-            <w:sz w:val="19"/>
           </w:rPr>
           <w:t>https://github.com/BharathGDevadiga/VoiceArmor-Edge</w:t>
         </w:r>
@@ -436,17 +434,6 @@
     </w:p>
     <w:p>
       <w:pPr>
-        <w:pStyle w:val="ListBullet"/>
-        <w:numPr>
-          <w:ilvl w:val="0"/>
-          <w:numId w:val="0"/>
-        </w:numPr>
-        <w:spacing w:line="360" w:lineRule="auto"/>
-        <w:jc w:val="both"/>
-      </w:pPr>
-    </w:p>
-    <w:p>
-      <w:pPr>
         <w:spacing w:before="120" w:line="360" w:lineRule="auto"/>
         <w:jc w:val="both"/>
       </w:pPr>
@@ -736,9 +723,9 @@
           <w:noProof/>
         </w:rPr>
         <w:drawing>
-          <wp:inline distT="0" distB="0" distL="0" distR="0" wp14:anchorId="0409A478" wp14:editId="77DCC45F">
-            <wp:extent cx="6242050" cy="2964180"/>
-            <wp:effectExtent l="0" t="0" r="6350" b="0"/>
+          <wp:inline distT="0" distB="0" distL="0" distR="0" wp14:anchorId="0409A478" wp14:editId="2C2E10C8">
+            <wp:extent cx="6278536" cy="2835823"/>
+            <wp:effectExtent l="0" t="0" r="8255" b="0"/>
             <wp:docPr id="1" name="Picture 1"/>
             <wp:cNvGraphicFramePr>
               <a:graphicFrameLocks xmlns:a="http://schemas.openxmlformats.org/drawingml/2006/main" noChangeAspect="1"/>
@@ -747,11 +734,17 @@
               <a:graphicData uri="http://schemas.openxmlformats.org/drawingml/2006/picture">
                 <pic:pic xmlns:pic="http://schemas.openxmlformats.org/drawingml/2006/picture">
                   <pic:nvPicPr>
-                    <pic:cNvPr id="0" name="voicearmor_architecture.png"/>
+                    <pic:cNvPr id="1" name="Picture 1"/>
                     <pic:cNvPicPr/>
                   </pic:nvPicPr>
                   <pic:blipFill>
-                    <a:blip r:embed="rId6"/>
+                    <a:blip r:embed="rId7">
+                      <a:extLst>
+                        <a:ext uri="{96DAC541-7B7A-43D3-8B79-37D633B846F1}">
+                          <asvg:svgBlip xmlns:asvg="http://schemas.microsoft.com/office/drawing/2016/SVG/main" r:embed="rId8"/>
+                        </a:ext>
+                      </a:extLst>
+                    </a:blip>
                     <a:stretch>
                       <a:fillRect/>
                     </a:stretch>
@@ -759,7 +752,7 @@
                   <pic:spPr>
                     <a:xfrm>
                       <a:off x="0" y="0"/>
-                      <a:ext cx="6278536" cy="2981506"/>
+                      <a:ext cx="6278536" cy="2835823"/>
                     </a:xfrm>
                     <a:prstGeom prst="rect">
                       <a:avLst/>
@@ -1463,27 +1456,21 @@
     <w:p>
       <w:pPr>
         <w:pStyle w:val="ListBullet"/>
-        <w:spacing w:line="360" w:lineRule="auto" w:after="40"/>
+        <w:spacing w:after="40" w:line="360" w:lineRule="auto"/>
         <w:jc w:val="both"/>
         <w:rPr>
           <w:color w:val="auto"/>
         </w:rPr>
       </w:pPr>
-      <w:r/>
       <w:r>
         <w:rPr>
-          <w:rFonts w:ascii="Segoe UI" w:hAnsi="Segoe UI"/>
           <w:b/>
-          <w:color w:val="323232"/>
-          <w:sz w:val="20"/>
         </w:rPr>
         <w:t xml:space="preserve">Source Code: </w:t>
       </w:r>
       <w:r>
         <w:rPr>
-          <w:rFonts w:ascii="Segoe UI" w:hAnsi="Segoe UI"/>
           <w:color w:val="3C3C3C"/>
-          <w:sz w:val="20"/>
         </w:rPr>
         <w:t>Full project code available on GitHub (</w:t>
       </w:r>
@@ -1491,18 +1478,15 @@
         <w:r>
           <w:rPr>
             <w:color w:val="1954A6"/>
+            <w:sz w:val="19"/>
             <w:u w:val="single"/>
-            <w:rFonts w:ascii="Segoe UI" w:hAnsi="Segoe UI"/>
-            <w:sz w:val="19"/>
           </w:rPr>
           <w:t>https://github.com/BharathGDevadiga/VoiceArmor-Edge</w:t>
         </w:r>
       </w:hyperlink>
       <w:r>
         <w:rPr>
-          <w:rFonts w:ascii="Segoe UI" w:hAnsi="Segoe UI"/>
           <w:color w:val="3C3C3C"/>
-          <w:sz w:val="20"/>
         </w:rPr>
         <w:t>) including the audio processing pipeline, NPU inference script and Arduino sketch.</w:t>
       </w:r>

</xml_diff>